<commit_message>
docs: add content chapter 4
</commit_message>
<xml_diff>
--- a/reports/words/de_cuong.docx
+++ b/reports/words/de_cuong.docx
@@ -34,46 +34,25 @@
     </w:p>
     <w:p>
       <w:pPr>
-        <w:rPr>
-          <w:b/>
-          <w:bCs/>
-        </w:rPr>
-      </w:pPr>
-      <w:r>
-        <w:rPr>
-          <w:b/>
-          <w:bCs/>
-        </w:rPr>
+        <w:pStyle w:val="Heading1"/>
+      </w:pPr>
+      <w:r>
         <w:t>CHƯƠNG 1. GIỚI THIỆU ĐỀ TÀI</w:t>
       </w:r>
     </w:p>
     <w:p>
       <w:pPr>
-        <w:rPr>
-          <w:b/>
-          <w:bCs/>
-        </w:rPr>
-      </w:pPr>
-      <w:r>
-        <w:rPr>
-          <w:b/>
-          <w:bCs/>
-        </w:rPr>
+        <w:pStyle w:val="Heading2"/>
+      </w:pPr>
+      <w:r>
         <w:t>1.1. Lý do chọn đề tài</w:t>
       </w:r>
     </w:p>
     <w:p>
       <w:pPr>
-        <w:rPr>
-          <w:b/>
-          <w:bCs/>
-        </w:rPr>
-      </w:pPr>
-      <w:r>
-        <w:rPr>
-          <w:b/>
-          <w:bCs/>
-        </w:rPr>
+        <w:pStyle w:val="Heading3"/>
+      </w:pPr>
+      <w:r>
         <w:t>1.1.1. Sự phát triển của thương mại điện tử</w:t>
       </w:r>
     </w:p>
@@ -156,16 +135,9 @@
     </w:p>
     <w:p>
       <w:pPr>
-        <w:rPr>
-          <w:b/>
-          <w:bCs/>
-        </w:rPr>
-      </w:pPr>
-      <w:r>
-        <w:rPr>
-          <w:b/>
-          <w:bCs/>
-        </w:rPr>
+        <w:pStyle w:val="Heading3"/>
+      </w:pPr>
+      <w:r>
         <w:t>1.1.2. Vai trò của Data Warehouse và Machine Learning</w:t>
       </w:r>
     </w:p>
@@ -248,16 +220,9 @@
     </w:p>
     <w:p>
       <w:pPr>
-        <w:rPr>
-          <w:b/>
-          <w:bCs/>
-        </w:rPr>
-      </w:pPr>
-      <w:r>
-        <w:rPr>
-          <w:b/>
-          <w:bCs/>
-        </w:rPr>
+        <w:pStyle w:val="Heading3"/>
+      </w:pPr>
+      <w:r>
         <w:t>1.1.3. Ý nghĩa thực tiễn của đề tài</w:t>
       </w:r>
     </w:p>
@@ -307,31 +272,17 @@
     </w:p>
     <w:p>
       <w:pPr>
-        <w:rPr>
-          <w:b/>
-          <w:bCs/>
-        </w:rPr>
-      </w:pPr>
-      <w:r>
-        <w:rPr>
-          <w:b/>
-          <w:bCs/>
-        </w:rPr>
+        <w:pStyle w:val="Heading2"/>
+      </w:pPr>
+      <w:r>
         <w:t>1.2. Mục tiêu nghiên cứu</w:t>
       </w:r>
     </w:p>
     <w:p>
       <w:pPr>
-        <w:rPr>
-          <w:b/>
-          <w:bCs/>
-        </w:rPr>
-      </w:pPr>
-      <w:r>
-        <w:rPr>
-          <w:b/>
-          <w:bCs/>
-        </w:rPr>
+        <w:pStyle w:val="Heading3"/>
+      </w:pPr>
+      <w:r>
         <w:t>1.2.1. Mục tiêu tổng quát</w:t>
       </w:r>
     </w:p>
@@ -342,16 +293,9 @@
     </w:p>
     <w:p>
       <w:pPr>
-        <w:rPr>
-          <w:b/>
-          <w:bCs/>
-        </w:rPr>
-      </w:pPr>
-      <w:r>
-        <w:rPr>
-          <w:b/>
-          <w:bCs/>
-        </w:rPr>
+        <w:pStyle w:val="Heading3"/>
+      </w:pPr>
+      <w:r>
         <w:t>1.2.2. Mục tiêu cụ thể</w:t>
       </w:r>
     </w:p>
@@ -446,31 +390,17 @@
     </w:p>
     <w:p>
       <w:pPr>
-        <w:rPr>
-          <w:b/>
-          <w:bCs/>
-        </w:rPr>
-      </w:pPr>
-      <w:r>
-        <w:rPr>
-          <w:b/>
-          <w:bCs/>
-        </w:rPr>
+        <w:pStyle w:val="Heading2"/>
+      </w:pPr>
+      <w:r>
         <w:t>1.3. Đối tượng và phạm vi nghiên cứu</w:t>
       </w:r>
     </w:p>
     <w:p>
       <w:pPr>
-        <w:rPr>
-          <w:b/>
-          <w:bCs/>
-        </w:rPr>
-      </w:pPr>
-      <w:r>
-        <w:rPr>
-          <w:b/>
-          <w:bCs/>
-        </w:rPr>
+        <w:pStyle w:val="Heading3"/>
+      </w:pPr>
+      <w:r>
         <w:t>1.3.1. Đối tượng nghiên cứu</w:t>
       </w:r>
     </w:p>
@@ -520,16 +450,9 @@
     </w:p>
     <w:p>
       <w:pPr>
-        <w:rPr>
-          <w:b/>
-          <w:bCs/>
-        </w:rPr>
-      </w:pPr>
-      <w:r>
-        <w:rPr>
-          <w:b/>
-          <w:bCs/>
-        </w:rPr>
+        <w:pStyle w:val="Heading3"/>
+      </w:pPr>
+      <w:r>
         <w:t>1.3.2. Phạm vi nghiên cứu</w:t>
       </w:r>
     </w:p>
@@ -697,486 +620,305 @@
           <w:b/>
           <w:bCs/>
         </w:rPr>
+        <w:br w:type="page"/>
+      </w:r>
+    </w:p>
+    <w:p>
+      <w:pPr>
+        <w:pStyle w:val="Heading1"/>
+      </w:pPr>
+      <w:r>
+        <w:lastRenderedPageBreak/>
         <w:t>CHƯƠNG 2. CƠ SỞ LÝ THUYẾT</w:t>
       </w:r>
     </w:p>
     <w:p>
       <w:pPr>
-        <w:rPr>
-          <w:b/>
-          <w:bCs/>
-        </w:rPr>
-      </w:pPr>
-      <w:r>
-        <w:rPr>
-          <w:b/>
-          <w:bCs/>
-        </w:rPr>
+        <w:pStyle w:val="Heading2"/>
+      </w:pPr>
+      <w:r>
         <w:t>2.1. Tổng quan về Data Warehouse</w:t>
       </w:r>
     </w:p>
     <w:p>
       <w:pPr>
-        <w:rPr>
-          <w:b/>
-          <w:bCs/>
-        </w:rPr>
-      </w:pPr>
-      <w:r>
-        <w:rPr>
-          <w:b/>
-          <w:bCs/>
-        </w:rPr>
+        <w:pStyle w:val="Heading3"/>
+      </w:pPr>
+      <w:r>
         <w:t>2.1.1. Khái niệm Data Warehouse</w:t>
       </w:r>
     </w:p>
     <w:p>
       <w:pPr>
-        <w:rPr>
-          <w:b/>
-          <w:bCs/>
-        </w:rPr>
-      </w:pPr>
-      <w:r>
-        <w:rPr>
-          <w:b/>
-          <w:bCs/>
-        </w:rPr>
+        <w:pStyle w:val="Heading3"/>
+      </w:pPr>
+      <w:r>
         <w:t>2.1.2. Kiến trúc Data Warehouse</w:t>
       </w:r>
     </w:p>
     <w:p>
       <w:pPr>
-        <w:rPr>
-          <w:b/>
-          <w:bCs/>
-        </w:rPr>
-      </w:pPr>
-      <w:r>
-        <w:rPr>
-          <w:b/>
-          <w:bCs/>
-        </w:rPr>
+        <w:pStyle w:val="Heading3"/>
+      </w:pPr>
+      <w:r>
+        <w:t>2.1.3. Vai trò của Data Warehouse trong doanh nghiệp</w:t>
+      </w:r>
+    </w:p>
+    <w:p/>
+    <w:p>
+      <w:pPr>
+        <w:pStyle w:val="Heading2"/>
+      </w:pPr>
+      <w:r>
+        <w:t>2.2. Quy trình ETL</w:t>
+      </w:r>
+    </w:p>
+    <w:p>
+      <w:pPr>
+        <w:pStyle w:val="Heading3"/>
+      </w:pPr>
+      <w:r>
+        <w:t>2.2.1. Extract</w:t>
+      </w:r>
+    </w:p>
+    <w:p>
+      <w:pPr>
+        <w:pStyle w:val="Heading3"/>
+      </w:pPr>
+      <w:r>
+        <w:t>2.2.2. Transform</w:t>
+      </w:r>
+    </w:p>
+    <w:p>
+      <w:pPr>
+        <w:pStyle w:val="Heading3"/>
+      </w:pPr>
+      <w:r>
+        <w:t>2.2.3. Load</w:t>
+      </w:r>
+    </w:p>
+    <w:p/>
+    <w:p>
+      <w:pPr>
+        <w:pStyle w:val="Heading2"/>
+      </w:pPr>
+      <w:r>
+        <w:t>2.3. Mô hình Star Schema</w:t>
+      </w:r>
+    </w:p>
+    <w:p>
+      <w:pPr>
+        <w:pStyle w:val="Heading3"/>
+      </w:pPr>
+      <w:r>
+        <w:t>2.3.1. Fact Table</w:t>
+      </w:r>
+    </w:p>
+    <w:p>
+      <w:pPr>
+        <w:pStyle w:val="Heading3"/>
+      </w:pPr>
+      <w:r>
+        <w:t>2.3.2. Dimension Table</w:t>
+      </w:r>
+    </w:p>
+    <w:p>
+      <w:pPr>
+        <w:pStyle w:val="Heading3"/>
+      </w:pPr>
+      <w:r>
+        <w:t>2.3.3. Quan hệ giữa các bảng</w:t>
+      </w:r>
+    </w:p>
+    <w:p/>
+    <w:p>
+      <w:pPr>
+        <w:pStyle w:val="Heading3"/>
+      </w:pPr>
+      <w:r>
+        <w:t>2.4. SQL trong phân tích dữ liệu</w:t>
+      </w:r>
+    </w:p>
+    <w:p>
+      <w:pPr>
+        <w:pStyle w:val="Heading3"/>
+      </w:pPr>
+      <w:r>
+        <w:t>2.4.1. SELECT và Filtering</w:t>
+      </w:r>
+    </w:p>
+    <w:p>
+      <w:pPr>
+        <w:pStyle w:val="Heading3"/>
+      </w:pPr>
+      <w:r>
+        <w:t>2.4.2. JOIN</w:t>
+      </w:r>
+    </w:p>
+    <w:p>
+      <w:pPr>
+        <w:pStyle w:val="Heading3"/>
+      </w:pPr>
+      <w:r>
+        <w:t>2.4.3. GROUP BY</w:t>
+      </w:r>
+    </w:p>
+    <w:p>
+      <w:pPr>
+        <w:pStyle w:val="Heading3"/>
+      </w:pPr>
+      <w:r>
+        <w:t>2.4.4. Window Function</w:t>
+      </w:r>
+    </w:p>
+    <w:p/>
+    <w:p>
+      <w:pPr>
+        <w:pStyle w:val="Heading2"/>
+      </w:pPr>
+      <w:r>
+        <w:t>2.5. Data Analytics trong E-Commerce</w:t>
+      </w:r>
+    </w:p>
+    <w:p>
+      <w:pPr>
+        <w:pStyle w:val="Heading3"/>
+      </w:pPr>
+      <w:r>
+        <w:t>2.5.1. Phân tích doanh thu</w:t>
+      </w:r>
+    </w:p>
+    <w:p>
+      <w:pPr>
+        <w:pStyle w:val="Heading3"/>
+      </w:pPr>
+      <w:r>
+        <w:t>2.5.2. Phân tích hành vi khách hàng</w:t>
+      </w:r>
+    </w:p>
+    <w:p>
+      <w:pPr>
+        <w:pStyle w:val="Heading3"/>
+      </w:pPr>
+      <w:r>
+        <w:t>2.5.3. Phân tích marketing</w:t>
+      </w:r>
+    </w:p>
+    <w:p>
+      <w:pPr>
+        <w:pStyle w:val="Heading3"/>
+      </w:pPr>
+      <w:r>
+        <w:t>2.5.4. Conversion Funnel</w:t>
+      </w:r>
+    </w:p>
+    <w:p/>
+    <w:p>
+      <w:pPr>
+        <w:pStyle w:val="Heading2"/>
+      </w:pPr>
+      <w:r>
+        <w:t>2.6. Tổng quan về Machine Learning</w:t>
+      </w:r>
+    </w:p>
+    <w:p>
+      <w:pPr>
+        <w:pStyle w:val="Heading3"/>
+      </w:pPr>
+      <w:r>
+        <w:t>2.6.1. Khái niệm Machine Learning</w:t>
+      </w:r>
+    </w:p>
+    <w:p>
+      <w:pPr>
+        <w:numPr>
+          <w:ilvl w:val="0"/>
+          <w:numId w:val="8"/>
+        </w:numPr>
+      </w:pPr>
+      <w:r>
+        <w:t xml:space="preserve">Định nghĩa Machine Learning. </w:t>
+      </w:r>
+    </w:p>
+    <w:p>
+      <w:pPr>
+        <w:numPr>
+          <w:ilvl w:val="0"/>
+          <w:numId w:val="8"/>
+        </w:numPr>
+      </w:pPr>
+      <w:r>
+        <w:t xml:space="preserve">Vai trò của Machine Learning trong doanh nghiệp. </w:t>
+      </w:r>
+    </w:p>
+    <w:p>
+      <w:pPr>
+        <w:numPr>
+          <w:ilvl w:val="0"/>
+          <w:numId w:val="8"/>
+        </w:numPr>
+      </w:pPr>
+      <w:r>
         <w:lastRenderedPageBreak/>
-        <w:t>2.1.3. Vai trò của Data Warehouse trong doanh nghiệp</w:t>
+        <w:t xml:space="preserve">Ứng dụng Machine Learning trong E-Commerce. </w:t>
+      </w:r>
+    </w:p>
+    <w:p>
+      <w:pPr>
+        <w:pStyle w:val="Heading3"/>
+      </w:pPr>
+      <w:r>
+        <w:t>2.6.2. Các loại Machine Learning</w:t>
+      </w:r>
+    </w:p>
+    <w:p>
+      <w:pPr>
+        <w:numPr>
+          <w:ilvl w:val="0"/>
+          <w:numId w:val="9"/>
+        </w:numPr>
+      </w:pPr>
+      <w:r>
+        <w:t xml:space="preserve">Supervised Learning. </w:t>
+      </w:r>
+    </w:p>
+    <w:p>
+      <w:pPr>
+        <w:numPr>
+          <w:ilvl w:val="0"/>
+          <w:numId w:val="9"/>
+        </w:numPr>
+      </w:pPr>
+      <w:r>
+        <w:t xml:space="preserve">Unsupervised Learning. </w:t>
+      </w:r>
+    </w:p>
+    <w:p>
+      <w:pPr>
+        <w:numPr>
+          <w:ilvl w:val="0"/>
+          <w:numId w:val="9"/>
+        </w:numPr>
+      </w:pPr>
+      <w:r>
+        <w:t xml:space="preserve">Reinforcement Learning. </w:t>
       </w:r>
     </w:p>
     <w:p/>
     <w:p>
       <w:pPr>
-        <w:rPr>
-          <w:b/>
-          <w:bCs/>
-        </w:rPr>
-      </w:pPr>
-      <w:r>
-        <w:rPr>
-          <w:b/>
-          <w:bCs/>
-        </w:rPr>
-        <w:t>2.2. Quy trình ETL</w:t>
-      </w:r>
-    </w:p>
-    <w:p>
-      <w:pPr>
-        <w:rPr>
-          <w:b/>
-          <w:bCs/>
-        </w:rPr>
-      </w:pPr>
-      <w:r>
-        <w:rPr>
-          <w:b/>
-          <w:bCs/>
-        </w:rPr>
-        <w:t>2.2.1. Extract</w:t>
-      </w:r>
-    </w:p>
-    <w:p>
-      <w:pPr>
-        <w:rPr>
-          <w:b/>
-          <w:bCs/>
-        </w:rPr>
-      </w:pPr>
-      <w:r>
-        <w:rPr>
-          <w:b/>
-          <w:bCs/>
-        </w:rPr>
-        <w:t>2.2.2. Transform</w:t>
-      </w:r>
-    </w:p>
-    <w:p>
-      <w:pPr>
-        <w:rPr>
-          <w:b/>
-          <w:bCs/>
-        </w:rPr>
-      </w:pPr>
-      <w:r>
-        <w:rPr>
-          <w:b/>
-          <w:bCs/>
-        </w:rPr>
-        <w:t>2.2.3. Load</w:t>
+        <w:pStyle w:val="Heading2"/>
+      </w:pPr>
+      <w:r>
+        <w:t>2.7. Các thuật toán Machine Learning sử dụng</w:t>
       </w:r>
     </w:p>
     <w:p/>
     <w:p>
       <w:pPr>
-        <w:rPr>
-          <w:b/>
-          <w:bCs/>
-        </w:rPr>
-      </w:pPr>
-      <w:r>
-        <w:rPr>
-          <w:b/>
-          <w:bCs/>
-        </w:rPr>
-        <w:t>2.3. Mô hình Star Schema</w:t>
-      </w:r>
-    </w:p>
-    <w:p>
-      <w:pPr>
-        <w:rPr>
-          <w:b/>
-          <w:bCs/>
-        </w:rPr>
-      </w:pPr>
-      <w:r>
-        <w:rPr>
-          <w:b/>
-          <w:bCs/>
-        </w:rPr>
-        <w:t>2.3.1. Fact Table</w:t>
-      </w:r>
-    </w:p>
-    <w:p>
-      <w:pPr>
-        <w:rPr>
-          <w:b/>
-          <w:bCs/>
-        </w:rPr>
-      </w:pPr>
-      <w:r>
-        <w:rPr>
-          <w:b/>
-          <w:bCs/>
-        </w:rPr>
-        <w:t>2.3.2. Dimension Table</w:t>
-      </w:r>
-    </w:p>
-    <w:p>
-      <w:pPr>
-        <w:rPr>
-          <w:b/>
-          <w:bCs/>
-        </w:rPr>
-      </w:pPr>
-      <w:r>
-        <w:rPr>
-          <w:b/>
-          <w:bCs/>
-        </w:rPr>
-        <w:t>2.3.3. Quan hệ giữa các bảng</w:t>
-      </w:r>
-    </w:p>
-    <w:p/>
-    <w:p>
-      <w:pPr>
-        <w:rPr>
-          <w:b/>
-          <w:bCs/>
-        </w:rPr>
-      </w:pPr>
-      <w:r>
-        <w:rPr>
-          <w:b/>
-          <w:bCs/>
-        </w:rPr>
-        <w:t>2.4. SQL trong phân tích dữ liệu</w:t>
-      </w:r>
-    </w:p>
-    <w:p>
-      <w:pPr>
-        <w:rPr>
-          <w:b/>
-          <w:bCs/>
-        </w:rPr>
-      </w:pPr>
-      <w:r>
-        <w:rPr>
-          <w:b/>
-          <w:bCs/>
-        </w:rPr>
-        <w:t>2.4.1. SELECT và Filtering</w:t>
-      </w:r>
-    </w:p>
-    <w:p>
-      <w:pPr>
-        <w:rPr>
-          <w:b/>
-          <w:bCs/>
-        </w:rPr>
-      </w:pPr>
-      <w:r>
-        <w:rPr>
-          <w:b/>
-          <w:bCs/>
-        </w:rPr>
-        <w:t>2.4.2. JOIN</w:t>
-      </w:r>
-    </w:p>
-    <w:p>
-      <w:pPr>
-        <w:rPr>
-          <w:b/>
-          <w:bCs/>
-        </w:rPr>
-      </w:pPr>
-      <w:r>
-        <w:rPr>
-          <w:b/>
-          <w:bCs/>
-        </w:rPr>
-        <w:t>2.4.3. GROUP BY</w:t>
-      </w:r>
-    </w:p>
-    <w:p>
-      <w:pPr>
-        <w:rPr>
-          <w:b/>
-          <w:bCs/>
-        </w:rPr>
-      </w:pPr>
-      <w:r>
-        <w:rPr>
-          <w:b/>
-          <w:bCs/>
-        </w:rPr>
-        <w:t>2.4.4. Window Function</w:t>
-      </w:r>
-    </w:p>
-    <w:p/>
-    <w:p>
-      <w:pPr>
-        <w:rPr>
-          <w:b/>
-          <w:bCs/>
-        </w:rPr>
-      </w:pPr>
-      <w:r>
-        <w:rPr>
-          <w:b/>
-          <w:bCs/>
-        </w:rPr>
-        <w:t>2.5. Data Analytics trong E-Commerce</w:t>
-      </w:r>
-    </w:p>
-    <w:p>
-      <w:pPr>
-        <w:rPr>
-          <w:b/>
-          <w:bCs/>
-        </w:rPr>
-      </w:pPr>
-      <w:r>
-        <w:rPr>
-          <w:b/>
-          <w:bCs/>
-        </w:rPr>
-        <w:t>2.5.1. Phân tích doanh thu</w:t>
-      </w:r>
-    </w:p>
-    <w:p>
-      <w:pPr>
-        <w:rPr>
-          <w:b/>
-          <w:bCs/>
-        </w:rPr>
-      </w:pPr>
-      <w:r>
-        <w:rPr>
-          <w:b/>
-          <w:bCs/>
-        </w:rPr>
-        <w:t>2.5.2. Phân tích hành vi khách hàng</w:t>
-      </w:r>
-    </w:p>
-    <w:p>
-      <w:pPr>
-        <w:rPr>
-          <w:b/>
-          <w:bCs/>
-        </w:rPr>
-      </w:pPr>
-      <w:r>
-        <w:rPr>
-          <w:b/>
-          <w:bCs/>
-        </w:rPr>
-        <w:t>2.5.3. Phân tích marketing</w:t>
-      </w:r>
-    </w:p>
-    <w:p>
-      <w:pPr>
-        <w:rPr>
-          <w:b/>
-          <w:bCs/>
-        </w:rPr>
-      </w:pPr>
-      <w:r>
-        <w:rPr>
-          <w:b/>
-          <w:bCs/>
-        </w:rPr>
-        <w:t>2.5.4. Conversion Funnel</w:t>
-      </w:r>
-    </w:p>
-    <w:p/>
-    <w:p>
-      <w:pPr>
-        <w:rPr>
-          <w:b/>
-          <w:bCs/>
-        </w:rPr>
-      </w:pPr>
-      <w:r>
-        <w:rPr>
-          <w:b/>
-          <w:bCs/>
-        </w:rPr>
-        <w:t>2.6. Tổng quan về Machine Learning</w:t>
-      </w:r>
-    </w:p>
-    <w:p>
-      <w:pPr>
-        <w:rPr>
-          <w:b/>
-          <w:bCs/>
-        </w:rPr>
-      </w:pPr>
-      <w:r>
-        <w:rPr>
-          <w:b/>
-          <w:bCs/>
-        </w:rPr>
-        <w:t>2.6.1. Khái niệm Machine Learning</w:t>
-      </w:r>
-    </w:p>
-    <w:p>
-      <w:pPr>
-        <w:numPr>
-          <w:ilvl w:val="0"/>
-          <w:numId w:val="8"/>
-        </w:numPr>
-      </w:pPr>
-      <w:r>
-        <w:t xml:space="preserve">Định nghĩa Machine Learning. </w:t>
-      </w:r>
-    </w:p>
-    <w:p>
-      <w:pPr>
-        <w:numPr>
-          <w:ilvl w:val="0"/>
-          <w:numId w:val="8"/>
-        </w:numPr>
-      </w:pPr>
-      <w:r>
-        <w:t xml:space="preserve">Vai trò của Machine Learning trong doanh nghiệp. </w:t>
-      </w:r>
-    </w:p>
-    <w:p>
-      <w:pPr>
-        <w:numPr>
-          <w:ilvl w:val="0"/>
-          <w:numId w:val="8"/>
-        </w:numPr>
-      </w:pPr>
-      <w:r>
-        <w:t xml:space="preserve">Ứng dụng Machine Learning trong E-Commerce. </w:t>
-      </w:r>
-    </w:p>
-    <w:p>
-      <w:pPr>
-        <w:rPr>
-          <w:b/>
-          <w:bCs/>
-        </w:rPr>
-      </w:pPr>
-      <w:r>
-        <w:rPr>
-          <w:b/>
-          <w:bCs/>
-        </w:rPr>
-        <w:t>2.6.2. Các loại Machine Learning</w:t>
-      </w:r>
-    </w:p>
-    <w:p>
-      <w:pPr>
-        <w:numPr>
-          <w:ilvl w:val="0"/>
-          <w:numId w:val="9"/>
-        </w:numPr>
-      </w:pPr>
-      <w:r>
-        <w:t xml:space="preserve">Supervised Learning. </w:t>
-      </w:r>
-    </w:p>
-    <w:p>
-      <w:pPr>
-        <w:numPr>
-          <w:ilvl w:val="0"/>
-          <w:numId w:val="9"/>
-        </w:numPr>
-      </w:pPr>
-      <w:r>
-        <w:t xml:space="preserve">Unsupervised Learning. </w:t>
-      </w:r>
-    </w:p>
-    <w:p>
-      <w:pPr>
-        <w:numPr>
-          <w:ilvl w:val="0"/>
-          <w:numId w:val="9"/>
-        </w:numPr>
-      </w:pPr>
-      <w:r>
-        <w:lastRenderedPageBreak/>
-        <w:t xml:space="preserve">Reinforcement Learning. </w:t>
-      </w:r>
-    </w:p>
-    <w:p/>
-    <w:p>
-      <w:pPr>
-        <w:rPr>
-          <w:b/>
-          <w:bCs/>
-        </w:rPr>
-      </w:pPr>
-      <w:r>
-        <w:rPr>
-          <w:b/>
-          <w:bCs/>
-        </w:rPr>
-        <w:t>2.7. Các thuật toán Machine Learning sử dụng</w:t>
-      </w:r>
-    </w:p>
-    <w:p/>
-    <w:p>
-      <w:pPr>
-        <w:rPr>
-          <w:b/>
-          <w:bCs/>
-        </w:rPr>
-      </w:pPr>
-      <w:r>
-        <w:rPr>
-          <w:b/>
-          <w:bCs/>
-        </w:rPr>
+        <w:pStyle w:val="Heading3"/>
+      </w:pPr>
+      <w:r>
         <w:t>2.7.1. Linear Regression</w:t>
       </w:r>
     </w:p>
@@ -1468,16 +1210,9 @@
     <w:p/>
     <w:p>
       <w:pPr>
-        <w:rPr>
-          <w:b/>
-          <w:bCs/>
-        </w:rPr>
-      </w:pPr>
-      <w:r>
-        <w:rPr>
-          <w:b/>
-          <w:bCs/>
-        </w:rPr>
+        <w:pStyle w:val="Heading3"/>
+      </w:pPr>
+      <w:r>
         <w:t>2.7.2. Logistic Regression</w:t>
       </w:r>
     </w:p>
@@ -1620,16 +1355,9 @@
     <w:p/>
     <w:p>
       <w:pPr>
-        <w:rPr>
-          <w:b/>
-          <w:bCs/>
-        </w:rPr>
-      </w:pPr>
-      <w:r>
-        <w:rPr>
-          <w:b/>
-          <w:bCs/>
-        </w:rPr>
+        <w:pStyle w:val="Heading3"/>
+      </w:pPr>
+      <w:r>
         <w:t>2.7.3. Decision Tree</w:t>
       </w:r>
     </w:p>
@@ -1808,6 +1536,7 @@
           <w:b/>
           <w:bCs/>
         </w:rPr>
+        <w:lastRenderedPageBreak/>
         <w:t>Ứng dụng:</w:t>
       </w:r>
     </w:p>
@@ -1836,16 +1565,9 @@
     <w:p/>
     <w:p>
       <w:pPr>
-        <w:rPr>
-          <w:b/>
-          <w:bCs/>
-        </w:rPr>
-      </w:pPr>
-      <w:r>
-        <w:rPr>
-          <w:b/>
-          <w:bCs/>
-        </w:rPr>
+        <w:pStyle w:val="Heading3"/>
+      </w:pPr>
+      <w:r>
         <w:t>2.7.4. Random Forest</w:t>
       </w:r>
     </w:p>
@@ -1937,16 +1659,9 @@
     <w:p/>
     <w:p>
       <w:pPr>
-        <w:rPr>
-          <w:b/>
-          <w:bCs/>
-        </w:rPr>
-      </w:pPr>
-      <w:r>
-        <w:rPr>
-          <w:b/>
-          <w:bCs/>
-        </w:rPr>
+        <w:pStyle w:val="Heading3"/>
+      </w:pPr>
+      <w:r>
         <w:t>2.7.5. XGBoost</w:t>
       </w:r>
     </w:p>
@@ -2038,16 +1753,9 @@
     <w:p/>
     <w:p>
       <w:pPr>
-        <w:rPr>
-          <w:b/>
-          <w:bCs/>
-        </w:rPr>
-      </w:pPr>
-      <w:r>
-        <w:rPr>
-          <w:b/>
-          <w:bCs/>
-        </w:rPr>
+        <w:pStyle w:val="Heading2"/>
+      </w:pPr>
+      <w:r>
         <w:t>2.8. Các phương pháp đánh giá mô hình</w:t>
       </w:r>
     </w:p>
@@ -2229,6 +1937,7 @@
             <w:rPr>
               <w:rFonts w:ascii="Cambria Math" w:hAnsi="Cambria Math"/>
             </w:rPr>
+            <w:lastRenderedPageBreak/>
             <m:t>F1=2×</m:t>
           </m:r>
           <m:f>
@@ -2281,7 +1990,6 @@
             <w:rPr>
               <w:rFonts w:ascii="Cambria Math" w:hAnsi="Cambria Math"/>
             </w:rPr>
-            <w:lastRenderedPageBreak/>
             <m:t>RMSE=</m:t>
           </m:r>
           <m:rad>
@@ -2503,66 +2211,47 @@
           <w:b/>
           <w:bCs/>
         </w:rPr>
+        <w:br w:type="page"/>
+      </w:r>
+    </w:p>
+    <w:p>
+      <w:pPr>
+        <w:pStyle w:val="Heading1"/>
+      </w:pPr>
+      <w:r>
+        <w:lastRenderedPageBreak/>
         <w:t>CHƯƠNG 3. CÀI ĐẶT THỰC NGHIỆM</w:t>
       </w:r>
     </w:p>
     <w:p>
       <w:pPr>
-        <w:rPr>
-          <w:b/>
-          <w:bCs/>
-        </w:rPr>
-      </w:pPr>
-      <w:r>
-        <w:rPr>
-          <w:b/>
-          <w:bCs/>
-        </w:rPr>
+        <w:pStyle w:val="Heading2"/>
+      </w:pPr>
+      <w:r>
         <w:t>3.1. Giới thiệu bộ dữ liệu</w:t>
       </w:r>
     </w:p>
     <w:p>
       <w:pPr>
-        <w:rPr>
-          <w:b/>
-          <w:bCs/>
-        </w:rPr>
-      </w:pPr>
-      <w:r>
-        <w:rPr>
-          <w:b/>
-          <w:bCs/>
-        </w:rPr>
+        <w:pStyle w:val="Heading3"/>
+      </w:pPr>
+      <w:r>
         <w:t>3.1.1. Dataset Maven Fuzzy Factory</w:t>
       </w:r>
     </w:p>
     <w:p>
       <w:pPr>
-        <w:rPr>
-          <w:b/>
-          <w:bCs/>
-        </w:rPr>
-      </w:pPr>
-      <w:r>
-        <w:rPr>
-          <w:b/>
-          <w:bCs/>
-        </w:rPr>
+        <w:pStyle w:val="Heading3"/>
+      </w:pPr>
+      <w:r>
         <w:t>3.1.2. Data Dictionary</w:t>
       </w:r>
     </w:p>
     <w:p>
       <w:pPr>
-        <w:rPr>
-          <w:b/>
-          <w:bCs/>
-        </w:rPr>
-      </w:pPr>
-      <w:r>
-        <w:rPr>
-          <w:b/>
-          <w:bCs/>
-        </w:rPr>
+        <w:pStyle w:val="Heading3"/>
+      </w:pPr>
+      <w:r>
         <w:t>3.1.3. Mô tả các bảng dữ liệu</w:t>
       </w:r>
     </w:p>
@@ -2584,20 +2273,22 @@
     </w:p>
     <w:p>
       <w:pPr>
-        <w:rPr>
-          <w:b/>
-          <w:bCs/>
-        </w:rPr>
-      </w:pPr>
-      <w:r>
-        <w:rPr>
-          <w:b/>
-          <w:bCs/>
-        </w:rPr>
+        <w:pStyle w:val="Heading3"/>
+      </w:pPr>
+      <w:r>
         <w:t>3.2.1. Kiến trúc hệ thống</w:t>
       </w:r>
     </w:p>
     <w:p>
+      <w:pPr>
+        <w:pBdr>
+          <w:top w:val="single" w:sz="4" w:space="1" w:color="auto"/>
+          <w:left w:val="single" w:sz="4" w:space="4" w:color="auto"/>
+          <w:bottom w:val="single" w:sz="4" w:space="1" w:color="auto"/>
+          <w:right w:val="single" w:sz="4" w:space="4" w:color="auto"/>
+        </w:pBdr>
+        <w:jc w:val="center"/>
+      </w:pPr>
       <w:r>
         <w:t>CSV Files</w:t>
       </w:r>
@@ -2652,16 +2343,9 @@
     </w:p>
     <w:p>
       <w:pPr>
-        <w:rPr>
-          <w:b/>
-          <w:bCs/>
-        </w:rPr>
-      </w:pPr>
-      <w:r>
-        <w:rPr>
-          <w:b/>
-          <w:bCs/>
-        </w:rPr>
+        <w:pStyle w:val="Heading3"/>
+      </w:pPr>
+      <w:r>
         <w:t>3.2.2. Thiết kế Data Warehouse</w:t>
       </w:r>
     </w:p>
@@ -2701,245 +2385,154 @@
     <w:p/>
     <w:p>
       <w:pPr>
-        <w:rPr>
-          <w:b/>
-          <w:bCs/>
-        </w:rPr>
-      </w:pPr>
-      <w:r>
-        <w:rPr>
-          <w:b/>
-          <w:bCs/>
-        </w:rPr>
+        <w:pStyle w:val="Heading2"/>
+      </w:pPr>
+      <w:r>
         <w:t>3.3. Xây dựng ETL</w:t>
       </w:r>
     </w:p>
     <w:p>
       <w:pPr>
-        <w:rPr>
-          <w:b/>
-          <w:bCs/>
-        </w:rPr>
-      </w:pPr>
-      <w:r>
-        <w:rPr>
-          <w:b/>
-          <w:bCs/>
-        </w:rPr>
+        <w:pStyle w:val="Heading3"/>
+      </w:pPr>
+      <w:r>
         <w:t>3.3.1. Import dữ liệu</w:t>
       </w:r>
     </w:p>
     <w:p>
       <w:pPr>
-        <w:rPr>
-          <w:b/>
-          <w:bCs/>
-        </w:rPr>
-      </w:pPr>
-      <w:r>
-        <w:rPr>
-          <w:b/>
-          <w:bCs/>
-        </w:rPr>
+        <w:pStyle w:val="Heading3"/>
+      </w:pPr>
+      <w:r>
         <w:t>3.3.2. Data Cleaning</w:t>
       </w:r>
     </w:p>
     <w:p>
       <w:pPr>
-        <w:rPr>
-          <w:b/>
-          <w:bCs/>
-        </w:rPr>
-      </w:pPr>
-      <w:r>
-        <w:rPr>
-          <w:b/>
-          <w:bCs/>
-        </w:rPr>
+        <w:pStyle w:val="Heading3"/>
+      </w:pPr>
+      <w:r>
+        <w:t>3.3.3. Feature Engineering</w:t>
+      </w:r>
+    </w:p>
+    <w:p>
+      <w:pPr>
+        <w:pStyle w:val="Heading3"/>
+      </w:pPr>
+      <w:r>
+        <w:t>3.3.4. Load Data Warehouse</w:t>
+      </w:r>
+    </w:p>
+    <w:p/>
+    <w:p>
+      <w:pPr>
+        <w:pStyle w:val="Heading2"/>
+      </w:pPr>
+      <w:r>
         <w:lastRenderedPageBreak/>
-        <w:t>3.3.3. Feature Engineering</w:t>
-      </w:r>
-    </w:p>
-    <w:p>
-      <w:pPr>
-        <w:rPr>
-          <w:b/>
-          <w:bCs/>
-        </w:rPr>
-      </w:pPr>
-      <w:r>
-        <w:rPr>
-          <w:b/>
-          <w:bCs/>
-        </w:rPr>
-        <w:t>3.3.4. Load Data Warehouse</w:t>
+        <w:t>3.4. Phân tích dữ liệu</w:t>
+      </w:r>
+    </w:p>
+    <w:p>
+      <w:pPr>
+        <w:pStyle w:val="Heading3"/>
+      </w:pPr>
+      <w:r>
+        <w:t>3.4.1. Phân tích sessions</w:t>
+      </w:r>
+    </w:p>
+    <w:p>
+      <w:pPr>
+        <w:pStyle w:val="Heading3"/>
+      </w:pPr>
+      <w:r>
+        <w:t>3.4.2. Phân tích conversion rate</w:t>
+      </w:r>
+    </w:p>
+    <w:p>
+      <w:pPr>
+        <w:pStyle w:val="Heading3"/>
+      </w:pPr>
+      <w:r>
+        <w:t>3.4.3. Phân tích doanh thu</w:t>
+      </w:r>
+    </w:p>
+    <w:p>
+      <w:pPr>
+        <w:pStyle w:val="Heading3"/>
+      </w:pPr>
+      <w:r>
+        <w:t>3.4.4. Phân tích marketing channels</w:t>
       </w:r>
     </w:p>
     <w:p/>
     <w:p>
       <w:pPr>
-        <w:rPr>
-          <w:b/>
-          <w:bCs/>
-        </w:rPr>
-      </w:pPr>
-      <w:r>
-        <w:rPr>
-          <w:b/>
-          <w:bCs/>
-        </w:rPr>
-        <w:t>3.4. Phân tích dữ liệu</w:t>
-      </w:r>
-    </w:p>
-    <w:p>
-      <w:pPr>
-        <w:rPr>
-          <w:b/>
-          <w:bCs/>
-        </w:rPr>
-      </w:pPr>
-      <w:r>
-        <w:rPr>
-          <w:b/>
-          <w:bCs/>
-        </w:rPr>
-        <w:t>3.4.1. Phân tích sessions</w:t>
-      </w:r>
-    </w:p>
-    <w:p>
-      <w:pPr>
-        <w:rPr>
-          <w:b/>
-          <w:bCs/>
-        </w:rPr>
-      </w:pPr>
-      <w:r>
-        <w:rPr>
-          <w:b/>
-          <w:bCs/>
-        </w:rPr>
-        <w:t>3.4.2. Phân tích conversion rate</w:t>
-      </w:r>
-    </w:p>
-    <w:p>
-      <w:pPr>
-        <w:rPr>
-          <w:b/>
-          <w:bCs/>
-        </w:rPr>
-      </w:pPr>
-      <w:r>
-        <w:rPr>
-          <w:b/>
-          <w:bCs/>
-        </w:rPr>
-        <w:t>3.4.3. Phân tích doanh thu</w:t>
-      </w:r>
-    </w:p>
-    <w:p>
-      <w:pPr>
-        <w:rPr>
-          <w:b/>
-          <w:bCs/>
-        </w:rPr>
-      </w:pPr>
-      <w:r>
-        <w:rPr>
-          <w:b/>
-          <w:bCs/>
-        </w:rPr>
-        <w:t>3.4.4. Phân tích marketing channels</w:t>
+        <w:pStyle w:val="Heading2"/>
+      </w:pPr>
+      <w:r>
+        <w:t>3.5. Xây dựng mô hình Machine Learning</w:t>
       </w:r>
     </w:p>
     <w:p/>
     <w:p>
       <w:pPr>
-        <w:rPr>
-          <w:b/>
-          <w:bCs/>
-        </w:rPr>
-      </w:pPr>
-      <w:r>
-        <w:rPr>
-          <w:b/>
-          <w:bCs/>
-        </w:rPr>
-        <w:t>3.5. Xây dựng mô hình Machine Learning</w:t>
+        <w:pStyle w:val="Heading3"/>
+      </w:pPr>
+      <w:r>
+        <w:t>3.5.1. Tiền xử lý dữ liệu</w:t>
+      </w:r>
+    </w:p>
+    <w:p>
+      <w:pPr>
+        <w:numPr>
+          <w:ilvl w:val="0"/>
+          <w:numId w:val="22"/>
+        </w:numPr>
+      </w:pPr>
+      <w:r>
+        <w:t xml:space="preserve">Missing values. </w:t>
+      </w:r>
+    </w:p>
+    <w:p>
+      <w:pPr>
+        <w:numPr>
+          <w:ilvl w:val="0"/>
+          <w:numId w:val="22"/>
+        </w:numPr>
+      </w:pPr>
+      <w:r>
+        <w:t xml:space="preserve">Encoding. </w:t>
+      </w:r>
+    </w:p>
+    <w:p>
+      <w:pPr>
+        <w:numPr>
+          <w:ilvl w:val="0"/>
+          <w:numId w:val="22"/>
+        </w:numPr>
+      </w:pPr>
+      <w:r>
+        <w:t xml:space="preserve">Feature scaling. </w:t>
+      </w:r>
+    </w:p>
+    <w:p>
+      <w:pPr>
+        <w:numPr>
+          <w:ilvl w:val="0"/>
+          <w:numId w:val="22"/>
+        </w:numPr>
+      </w:pPr>
+      <w:r>
+        <w:t xml:space="preserve">Train/Test Split. </w:t>
       </w:r>
     </w:p>
     <w:p/>
     <w:p>
       <w:pPr>
-        <w:rPr>
-          <w:b/>
-          <w:bCs/>
-        </w:rPr>
-      </w:pPr>
-      <w:r>
-        <w:rPr>
-          <w:b/>
-          <w:bCs/>
-        </w:rPr>
-        <w:t>3.5.1. Tiền xử lý dữ liệu</w:t>
-      </w:r>
-    </w:p>
-    <w:p>
-      <w:pPr>
-        <w:numPr>
-          <w:ilvl w:val="0"/>
-          <w:numId w:val="22"/>
-        </w:numPr>
-      </w:pPr>
-      <w:r>
-        <w:t xml:space="preserve">Missing values. </w:t>
-      </w:r>
-    </w:p>
-    <w:p>
-      <w:pPr>
-        <w:numPr>
-          <w:ilvl w:val="0"/>
-          <w:numId w:val="22"/>
-        </w:numPr>
-      </w:pPr>
-      <w:r>
-        <w:t xml:space="preserve">Encoding. </w:t>
-      </w:r>
-    </w:p>
-    <w:p>
-      <w:pPr>
-        <w:numPr>
-          <w:ilvl w:val="0"/>
-          <w:numId w:val="22"/>
-        </w:numPr>
-      </w:pPr>
-      <w:r>
-        <w:t xml:space="preserve">Feature scaling. </w:t>
-      </w:r>
-    </w:p>
-    <w:p>
-      <w:pPr>
-        <w:numPr>
-          <w:ilvl w:val="0"/>
-          <w:numId w:val="22"/>
-        </w:numPr>
-      </w:pPr>
-      <w:r>
-        <w:t xml:space="preserve">Train/Test Split. </w:t>
-      </w:r>
-    </w:p>
-    <w:p/>
-    <w:p>
-      <w:pPr>
-        <w:rPr>
-          <w:b/>
-          <w:bCs/>
-        </w:rPr>
-      </w:pPr>
-      <w:r>
-        <w:rPr>
-          <w:b/>
-          <w:bCs/>
-        </w:rPr>
+        <w:pStyle w:val="Heading3"/>
+      </w:pPr>
+      <w:r>
         <w:t>3.5.2. Xây dựng mô hình dự đoán</w:t>
       </w:r>
     </w:p>
@@ -3125,21 +2718,186 @@
         </w:numPr>
       </w:pPr>
       <w:r>
+        <w:t xml:space="preserve">Boosting training. </w:t>
+      </w:r>
+    </w:p>
+    <w:p>
+      <w:pPr>
+        <w:numPr>
+          <w:ilvl w:val="0"/>
+          <w:numId w:val="27"/>
+        </w:numPr>
+      </w:pPr>
+      <w:r>
+        <w:t xml:space="preserve">Performance optimization. </w:t>
+      </w:r>
+    </w:p>
+    <w:p>
+      <w:pPr>
+        <w:pStyle w:val="Heading2"/>
+      </w:pPr>
+      <w:r>
         <w:lastRenderedPageBreak/>
-        <w:t xml:space="preserve">Boosting training. </w:t>
-      </w:r>
-    </w:p>
-    <w:p>
-      <w:pPr>
-        <w:numPr>
-          <w:ilvl w:val="0"/>
-          <w:numId w:val="27"/>
-        </w:numPr>
-      </w:pPr>
-      <w:r>
-        <w:t xml:space="preserve">Performance optimization. </w:t>
-      </w:r>
-    </w:p>
+        <w:t>3.6. Đánh giá mô hình</w:t>
+      </w:r>
+    </w:p>
+    <w:p>
+      <w:pPr>
+        <w:pStyle w:val="Heading3"/>
+      </w:pPr>
+      <w:r>
+        <w:t>3.6.1. So sánh các mô hình</w:t>
+      </w:r>
+    </w:p>
+    <w:p>
+      <w:pPr>
+        <w:numPr>
+          <w:ilvl w:val="0"/>
+          <w:numId w:val="28"/>
+        </w:numPr>
+      </w:pPr>
+      <w:r>
+        <w:t xml:space="preserve">Accuracy. </w:t>
+      </w:r>
+    </w:p>
+    <w:p>
+      <w:pPr>
+        <w:numPr>
+          <w:ilvl w:val="0"/>
+          <w:numId w:val="28"/>
+        </w:numPr>
+      </w:pPr>
+      <w:r>
+        <w:t xml:space="preserve">Precision. </w:t>
+      </w:r>
+    </w:p>
+    <w:p>
+      <w:pPr>
+        <w:numPr>
+          <w:ilvl w:val="0"/>
+          <w:numId w:val="28"/>
+        </w:numPr>
+      </w:pPr>
+      <w:r>
+        <w:t xml:space="preserve">Recall. </w:t>
+      </w:r>
+    </w:p>
+    <w:p>
+      <w:pPr>
+        <w:numPr>
+          <w:ilvl w:val="0"/>
+          <w:numId w:val="28"/>
+        </w:numPr>
+      </w:pPr>
+      <w:r>
+        <w:t xml:space="preserve">F1-score. </w:t>
+      </w:r>
+    </w:p>
+    <w:p>
+      <w:pPr>
+        <w:numPr>
+          <w:ilvl w:val="0"/>
+          <w:numId w:val="28"/>
+        </w:numPr>
+      </w:pPr>
+      <w:r>
+        <w:t xml:space="preserve">ROC-AUC. </w:t>
+      </w:r>
+    </w:p>
+    <w:p>
+      <w:pPr>
+        <w:numPr>
+          <w:ilvl w:val="0"/>
+          <w:numId w:val="28"/>
+        </w:numPr>
+      </w:pPr>
+      <w:r>
+        <w:t xml:space="preserve">RMSE. </w:t>
+      </w:r>
+    </w:p>
+    <w:p>
+      <w:pPr>
+        <w:pStyle w:val="Heading3"/>
+      </w:pPr>
+      <w:r>
+        <w:t>3.6.2. Phân tích kết quả</w:t>
+      </w:r>
+    </w:p>
+    <w:p>
+      <w:pPr>
+        <w:numPr>
+          <w:ilvl w:val="0"/>
+          <w:numId w:val="29"/>
+        </w:numPr>
+      </w:pPr>
+      <w:r>
+        <w:t xml:space="preserve">So sánh hiệu suất. </w:t>
+      </w:r>
+    </w:p>
+    <w:p>
+      <w:pPr>
+        <w:numPr>
+          <w:ilvl w:val="0"/>
+          <w:numId w:val="29"/>
+        </w:numPr>
+      </w:pPr>
+      <w:r>
+        <w:t xml:space="preserve">Phân tích overfitting. </w:t>
+      </w:r>
+    </w:p>
+    <w:p>
+      <w:pPr>
+        <w:numPr>
+          <w:ilvl w:val="0"/>
+          <w:numId w:val="29"/>
+        </w:numPr>
+      </w:pPr>
+      <w:r>
+        <w:t xml:space="preserve">Đánh giá khả năng ứng dụng thực tế. </w:t>
+      </w:r>
+    </w:p>
+    <w:p/>
+    <w:p>
+      <w:pPr>
+        <w:pStyle w:val="Heading2"/>
+      </w:pPr>
+      <w:r>
+        <w:t>3.7. Xây dựng Dashboard Power BI</w:t>
+      </w:r>
+    </w:p>
+    <w:p>
+      <w:pPr>
+        <w:pStyle w:val="Heading3"/>
+      </w:pPr>
+      <w:r>
+        <w:t>3.7.1. Dashboard tổng quan</w:t>
+      </w:r>
+    </w:p>
+    <w:p>
+      <w:pPr>
+        <w:pStyle w:val="Heading3"/>
+      </w:pPr>
+      <w:r>
+        <w:t>3.7.2. Dashboard doanh thu</w:t>
+      </w:r>
+    </w:p>
+    <w:p>
+      <w:pPr>
+        <w:pStyle w:val="Heading3"/>
+      </w:pPr>
+      <w:r>
+        <w:t>3.7.3. Dashboard marketing</w:t>
+      </w:r>
+    </w:p>
+    <w:p>
+      <w:pPr>
+        <w:pStyle w:val="Heading3"/>
+      </w:pPr>
+      <w:r>
+        <w:t>3.7.4. Dashboard Machine Learning Prediction</w:t>
+      </w:r>
+    </w:p>
+    <w:p/>
     <w:p>
       <w:pPr>
         <w:rPr>
@@ -3152,7 +2910,19 @@
           <w:b/>
           <w:bCs/>
         </w:rPr>
-        <w:t>3.6. Đánh giá mô hình</w:t>
+        <w:br w:type="page"/>
+      </w:r>
+    </w:p>
+    <w:p>
+      <w:pPr>
+        <w:pStyle w:val="Heading1"/>
+      </w:pPr>
+      <w:r>
+        <w:lastRenderedPageBreak/>
+        <w:t xml:space="preserve">CHƯƠNG 4. </w:t>
+      </w:r>
+      <w:r>
+        <w:t>XÂY DỰNG ỨNG DỤNG DỰ ĐOÁN</w:t>
       </w:r>
     </w:p>
     <w:p>
@@ -3167,73 +2937,16 @@
           <w:b/>
           <w:bCs/>
         </w:rPr>
-        <w:t>3.6.1. So sánh các mô hình</w:t>
-      </w:r>
-    </w:p>
-    <w:p>
-      <w:pPr>
-        <w:numPr>
-          <w:ilvl w:val="0"/>
-          <w:numId w:val="28"/>
-        </w:numPr>
-      </w:pPr>
-      <w:r>
-        <w:t xml:space="preserve">Accuracy. </w:t>
-      </w:r>
-    </w:p>
-    <w:p>
-      <w:pPr>
-        <w:numPr>
-          <w:ilvl w:val="0"/>
-          <w:numId w:val="28"/>
-        </w:numPr>
-      </w:pPr>
-      <w:r>
-        <w:t xml:space="preserve">Precision. </w:t>
-      </w:r>
-    </w:p>
-    <w:p>
-      <w:pPr>
-        <w:numPr>
-          <w:ilvl w:val="0"/>
-          <w:numId w:val="28"/>
-        </w:numPr>
-      </w:pPr>
-      <w:r>
-        <w:t xml:space="preserve">Recall. </w:t>
-      </w:r>
-    </w:p>
-    <w:p>
-      <w:pPr>
-        <w:numPr>
-          <w:ilvl w:val="0"/>
-          <w:numId w:val="28"/>
-        </w:numPr>
-      </w:pPr>
-      <w:r>
-        <w:t xml:space="preserve">F1-score. </w:t>
-      </w:r>
-    </w:p>
-    <w:p>
-      <w:pPr>
-        <w:numPr>
-          <w:ilvl w:val="0"/>
-          <w:numId w:val="28"/>
-        </w:numPr>
-      </w:pPr>
-      <w:r>
-        <w:t xml:space="preserve">ROC-AUC. </w:t>
-      </w:r>
-    </w:p>
-    <w:p>
-      <w:pPr>
-        <w:numPr>
-          <w:ilvl w:val="0"/>
-          <w:numId w:val="28"/>
-        </w:numPr>
-      </w:pPr>
-      <w:r>
-        <w:t xml:space="preserve">RMSE. </w:t>
+        <w:br w:type="page"/>
+      </w:r>
+    </w:p>
+    <w:p>
+      <w:pPr>
+        <w:pStyle w:val="Heading1"/>
+      </w:pPr>
+      <w:r>
+        <w:lastRenderedPageBreak/>
+        <w:t>KẾT LUẬN VÀ HƯỚNG PHÁT TRIỂN</w:t>
       </w:r>
     </w:p>
     <w:p>
@@ -3248,40 +2961,40 @@
           <w:b/>
           <w:bCs/>
         </w:rPr>
-        <w:t>3.6.2. Phân tích kết quả</w:t>
-      </w:r>
-    </w:p>
-    <w:p>
-      <w:pPr>
-        <w:numPr>
-          <w:ilvl w:val="0"/>
-          <w:numId w:val="29"/>
-        </w:numPr>
-      </w:pPr>
-      <w:r>
-        <w:t xml:space="preserve">So sánh hiệu suất. </w:t>
-      </w:r>
-    </w:p>
-    <w:p>
-      <w:pPr>
-        <w:numPr>
-          <w:ilvl w:val="0"/>
-          <w:numId w:val="29"/>
-        </w:numPr>
-      </w:pPr>
-      <w:r>
-        <w:t xml:space="preserve">Phân tích overfitting. </w:t>
-      </w:r>
-    </w:p>
-    <w:p>
-      <w:pPr>
-        <w:numPr>
-          <w:ilvl w:val="0"/>
-          <w:numId w:val="29"/>
-        </w:numPr>
-      </w:pPr>
-      <w:r>
-        <w:t xml:space="preserve">Đánh giá khả năng ứng dụng thực tế. </w:t>
+        <w:t>Kết luận</w:t>
+      </w:r>
+    </w:p>
+    <w:p>
+      <w:pPr>
+        <w:numPr>
+          <w:ilvl w:val="0"/>
+          <w:numId w:val="30"/>
+        </w:numPr>
+      </w:pPr>
+      <w:r>
+        <w:t xml:space="preserve">Tổng kết nội dung thực hiện. </w:t>
+      </w:r>
+    </w:p>
+    <w:p>
+      <w:pPr>
+        <w:numPr>
+          <w:ilvl w:val="0"/>
+          <w:numId w:val="30"/>
+        </w:numPr>
+      </w:pPr>
+      <w:r>
+        <w:t xml:space="preserve">Đánh giá hệ thống. </w:t>
+      </w:r>
+    </w:p>
+    <w:p>
+      <w:pPr>
+        <w:numPr>
+          <w:ilvl w:val="0"/>
+          <w:numId w:val="30"/>
+        </w:numPr>
+      </w:pPr>
+      <w:r>
+        <w:t xml:space="preserve">Kết quả đạt được. </w:t>
       </w:r>
     </w:p>
     <w:p/>
@@ -3297,147 +3010,7 @@
           <w:b/>
           <w:bCs/>
         </w:rPr>
-        <w:t>3.7. Xây dựng Dashboard Power BI</w:t>
-      </w:r>
-    </w:p>
-    <w:p>
-      <w:pPr>
-        <w:rPr>
-          <w:b/>
-          <w:bCs/>
-        </w:rPr>
-      </w:pPr>
-      <w:r>
-        <w:rPr>
-          <w:b/>
-          <w:bCs/>
-        </w:rPr>
-        <w:t>3.7.1. Dashboard tổng quan</w:t>
-      </w:r>
-    </w:p>
-    <w:p>
-      <w:pPr>
-        <w:rPr>
-          <w:b/>
-          <w:bCs/>
-        </w:rPr>
-      </w:pPr>
-      <w:r>
-        <w:rPr>
-          <w:b/>
-          <w:bCs/>
-        </w:rPr>
-        <w:t>3.7.2. Dashboard doanh thu</w:t>
-      </w:r>
-    </w:p>
-    <w:p>
-      <w:pPr>
-        <w:rPr>
-          <w:b/>
-          <w:bCs/>
-        </w:rPr>
-      </w:pPr>
-      <w:r>
-        <w:rPr>
-          <w:b/>
-          <w:bCs/>
-        </w:rPr>
-        <w:t>3.7.3. Dashboard marketing</w:t>
-      </w:r>
-    </w:p>
-    <w:p>
-      <w:pPr>
-        <w:rPr>
-          <w:b/>
-          <w:bCs/>
-        </w:rPr>
-      </w:pPr>
-      <w:r>
-        <w:rPr>
-          <w:b/>
-          <w:bCs/>
-        </w:rPr>
-        <w:t>3.7.4. Dashboard Machine Learning Prediction</w:t>
-      </w:r>
-    </w:p>
-    <w:p/>
-    <w:p>
-      <w:pPr>
-        <w:rPr>
-          <w:b/>
-          <w:bCs/>
-        </w:rPr>
-      </w:pPr>
-      <w:r>
-        <w:rPr>
-          <w:b/>
-          <w:bCs/>
-        </w:rPr>
-        <w:t>CHƯƠNG 4. KẾT LUẬN VÀ HƯỚNG PHÁT TRIỂN</w:t>
-      </w:r>
-    </w:p>
-    <w:p>
-      <w:pPr>
-        <w:rPr>
-          <w:b/>
-          <w:bCs/>
-        </w:rPr>
-      </w:pPr>
-      <w:r>
-        <w:rPr>
-          <w:b/>
-          <w:bCs/>
-        </w:rPr>
-        <w:t>4.1. Kết luận</w:t>
-      </w:r>
-    </w:p>
-    <w:p>
-      <w:pPr>
-        <w:numPr>
-          <w:ilvl w:val="0"/>
-          <w:numId w:val="30"/>
-        </w:numPr>
-      </w:pPr>
-      <w:r>
-        <w:t xml:space="preserve">Tổng kết nội dung thực hiện. </w:t>
-      </w:r>
-    </w:p>
-    <w:p>
-      <w:pPr>
-        <w:numPr>
-          <w:ilvl w:val="0"/>
-          <w:numId w:val="30"/>
-        </w:numPr>
-      </w:pPr>
-      <w:r>
-        <w:t xml:space="preserve">Đánh giá hệ thống. </w:t>
-      </w:r>
-    </w:p>
-    <w:p>
-      <w:pPr>
-        <w:numPr>
-          <w:ilvl w:val="0"/>
-          <w:numId w:val="30"/>
-        </w:numPr>
-      </w:pPr>
-      <w:r>
-        <w:t xml:space="preserve">Kết quả đạt được. </w:t>
-      </w:r>
-    </w:p>
-    <w:p/>
-    <w:p>
-      <w:pPr>
-        <w:rPr>
-          <w:b/>
-          <w:bCs/>
-        </w:rPr>
-      </w:pPr>
-      <w:r>
-        <w:rPr>
-          <w:b/>
-          <w:bCs/>
-        </w:rPr>
-        <w:t>4.2. Hướng phát triển</w:t>
+        <w:t>Hướng phát triển</w:t>
       </w:r>
     </w:p>
     <w:p>
@@ -3492,8 +3065,21 @@
         </w:numPr>
       </w:pPr>
       <w:r>
+        <w:t>Deploy hệ thống trên Cloud.</w:t>
+      </w:r>
+    </w:p>
+    <w:p>
+      <w:r>
+        <w:br w:type="page"/>
+      </w:r>
+    </w:p>
+    <w:p>
+      <w:pPr>
+        <w:pStyle w:val="Heading1"/>
+      </w:pPr>
+      <w:r>
         <w:lastRenderedPageBreak/>
-        <w:t>Deploy hệ thống trên Cloud.</w:t>
+        <w:t xml:space="preserve">TÀI LIỆU THAM KHẢO </w:t>
       </w:r>
     </w:p>
     <w:p/>
@@ -3505,6 +3091,34 @@
     </w:sectPr>
   </w:body>
 </w:document>
+</file>
+
+<file path=word/customizations.xml><?xml version="1.0" encoding="utf-8"?>
+<wne:tcg xmlns:r="http://schemas.openxmlformats.org/officeDocument/2006/relationships" xmlns:wne="http://schemas.microsoft.com/office/word/2006/wordml">
+  <wne:keymaps>
+    <wne:keymap wne:kcmPrimary="0231">
+      <wne:acd wne:acdName="acd0"/>
+    </wne:keymap>
+    <wne:keymap wne:kcmPrimary="0232">
+      <wne:acd wne:acdName="acd1"/>
+    </wne:keymap>
+    <wne:keymap wne:kcmPrimary="0233">
+      <wne:acd wne:acdName="acd2"/>
+    </wne:keymap>
+  </wne:keymaps>
+  <wne:toolbars>
+    <wne:acdManifest>
+      <wne:acdEntry wne:acdName="acd0"/>
+      <wne:acdEntry wne:acdName="acd1"/>
+      <wne:acdEntry wne:acdName="acd2"/>
+    </wne:acdManifest>
+  </wne:toolbars>
+  <wne:acds>
+    <wne:acd wne:argValue="AQAAAAEA" wne:acdName="acd0" wne:fciIndexBasedOn="0065"/>
+    <wne:acd wne:argValue="AQAAAAIA" wne:acdName="acd1" wne:fciIndexBasedOn="0065"/>
+    <wne:acd wne:argValue="AQAAAAMA" wne:acdName="acd2" wne:fciIndexBasedOn="0065"/>
+  </wne:acds>
+</wne:tcg>
 </file>
 
 <file path=word/numbering.xml><?xml version="1.0" encoding="utf-8"?>
@@ -8633,17 +8247,17 @@
     <w:link w:val="Heading1Char"/>
     <w:uiPriority w:val="9"/>
     <w:qFormat/>
-    <w:rsid w:val="00D64631"/>
+    <w:rsid w:val="00160CE7"/>
     <w:pPr>
       <w:keepNext/>
       <w:keepLines/>
       <w:spacing w:before="360" w:after="80"/>
+      <w:jc w:val="center"/>
       <w:outlineLvl w:val="0"/>
     </w:pPr>
     <w:rPr>
-      <w:rFonts w:asciiTheme="majorHAnsi" w:eastAsiaTheme="majorEastAsia" w:hAnsiTheme="majorHAnsi" w:cstheme="majorBidi"/>
-      <w:color w:val="0F4761" w:themeColor="accent1" w:themeShade="BF"/>
-      <w:sz w:val="40"/>
+      <w:rFonts w:eastAsiaTheme="majorEastAsia" w:cstheme="majorBidi"/>
+      <w:b/>
       <w:szCs w:val="40"/>
     </w:rPr>
   </w:style>
@@ -8653,10 +8267,9 @@
     <w:next w:val="Normal"/>
     <w:link w:val="Heading2Char"/>
     <w:uiPriority w:val="9"/>
-    <w:semiHidden/>
     <w:unhideWhenUsed/>
     <w:qFormat/>
-    <w:rsid w:val="00D64631"/>
+    <w:rsid w:val="00160CE7"/>
     <w:pPr>
       <w:keepNext/>
       <w:keepLines/>
@@ -8664,9 +8277,8 @@
       <w:outlineLvl w:val="1"/>
     </w:pPr>
     <w:rPr>
-      <w:rFonts w:asciiTheme="majorHAnsi" w:eastAsiaTheme="majorEastAsia" w:hAnsiTheme="majorHAnsi" w:cstheme="majorBidi"/>
-      <w:color w:val="0F4761" w:themeColor="accent1" w:themeShade="BF"/>
-      <w:sz w:val="32"/>
+      <w:rFonts w:eastAsiaTheme="majorEastAsia" w:cstheme="majorBidi"/>
+      <w:b/>
       <w:szCs w:val="32"/>
     </w:rPr>
   </w:style>
@@ -8676,20 +8288,19 @@
     <w:next w:val="Normal"/>
     <w:link w:val="Heading3Char"/>
     <w:uiPriority w:val="9"/>
-    <w:semiHidden/>
     <w:unhideWhenUsed/>
     <w:qFormat/>
-    <w:rsid w:val="00D64631"/>
+    <w:rsid w:val="00160CE7"/>
     <w:pPr>
       <w:keepNext/>
       <w:keepLines/>
       <w:spacing w:before="160" w:after="80"/>
+      <w:jc w:val="both"/>
       <w:outlineLvl w:val="2"/>
     </w:pPr>
     <w:rPr>
-      <w:rFonts w:asciiTheme="minorHAnsi" w:eastAsiaTheme="majorEastAsia" w:hAnsiTheme="minorHAnsi" w:cstheme="majorBidi"/>
-      <w:color w:val="0F4761" w:themeColor="accent1" w:themeShade="BF"/>
-      <w:sz w:val="28"/>
+      <w:rFonts w:eastAsiaTheme="majorEastAsia" w:cstheme="majorBidi"/>
+      <w:i/>
       <w:szCs w:val="28"/>
     </w:rPr>
   </w:style>
@@ -8828,6 +8439,7 @@
   <w:style w:type="character" w:default="1" w:styleId="DefaultParagraphFont">
     <w:name w:val="Default Paragraph Font"/>
     <w:uiPriority w:val="1"/>
+    <w:semiHidden/>
     <w:unhideWhenUsed/>
   </w:style>
   <w:style w:type="table" w:default="1" w:styleId="TableNormal">
@@ -8856,11 +8468,10 @@
     <w:basedOn w:val="DefaultParagraphFont"/>
     <w:link w:val="Heading1"/>
     <w:uiPriority w:val="9"/>
-    <w:rsid w:val="00D64631"/>
+    <w:rsid w:val="00160CE7"/>
     <w:rPr>
-      <w:rFonts w:asciiTheme="majorHAnsi" w:eastAsiaTheme="majorEastAsia" w:hAnsiTheme="majorHAnsi" w:cstheme="majorBidi"/>
-      <w:color w:val="0F4761" w:themeColor="accent1" w:themeShade="BF"/>
-      <w:sz w:val="40"/>
+      <w:rFonts w:eastAsiaTheme="majorEastAsia" w:cstheme="majorBidi"/>
+      <w:b/>
       <w:szCs w:val="40"/>
     </w:rPr>
   </w:style>
@@ -8869,12 +8480,10 @@
     <w:basedOn w:val="DefaultParagraphFont"/>
     <w:link w:val="Heading2"/>
     <w:uiPriority w:val="9"/>
-    <w:semiHidden/>
-    <w:rsid w:val="00D64631"/>
+    <w:rsid w:val="00160CE7"/>
     <w:rPr>
-      <w:rFonts w:asciiTheme="majorHAnsi" w:eastAsiaTheme="majorEastAsia" w:hAnsiTheme="majorHAnsi" w:cstheme="majorBidi"/>
-      <w:color w:val="0F4761" w:themeColor="accent1" w:themeShade="BF"/>
-      <w:sz w:val="32"/>
+      <w:rFonts w:eastAsiaTheme="majorEastAsia" w:cstheme="majorBidi"/>
+      <w:b/>
       <w:szCs w:val="32"/>
     </w:rPr>
   </w:style>
@@ -8883,12 +8492,10 @@
     <w:basedOn w:val="DefaultParagraphFont"/>
     <w:link w:val="Heading3"/>
     <w:uiPriority w:val="9"/>
-    <w:semiHidden/>
-    <w:rsid w:val="00D64631"/>
+    <w:rsid w:val="00160CE7"/>
     <w:rPr>
-      <w:rFonts w:asciiTheme="minorHAnsi" w:eastAsiaTheme="majorEastAsia" w:hAnsiTheme="minorHAnsi" w:cstheme="majorBidi"/>
-      <w:color w:val="0F4761" w:themeColor="accent1" w:themeShade="BF"/>
-      <w:sz w:val="28"/>
+      <w:rFonts w:eastAsiaTheme="majorEastAsia" w:cstheme="majorBidi"/>
+      <w:i/>
       <w:szCs w:val="28"/>
     </w:rPr>
   </w:style>

</xml_diff>